<commit_message>
Corrige linha do Monitor Serial no mapa do contador (usa USB, nao pinos 0/1)
Co-Authored-By: Claude Opus 5.5 <noreply@anthropic.com>
Claude-Session: https://claude.ai/code/session_01U2mYnEFpZqRi5KvLYWwkHh
</commit_message>
<xml_diff>
--- a/Roteiro_Arduino_CMC_preenchido.docx
+++ b/Roteiro_Arduino_CMC_preenchido.docx
@@ -4496,7 +4496,7 @@
                 <w:sz w:val="20"/>
                 <w:szCs w:val="20"/>
               </w:rPr>
-              <w:t xml:space="preserve">Monitor Serial (cabo USB / PC)</w:t>
+              <w:t xml:space="preserve">Monitor Serial (só o cabo USB no PC — não ligar nada nos pinos 0 e 1)</w:t>
             </w:r>
           </w:p>
         </w:tc>
@@ -4525,7 +4525,7 @@
                 <w:sz w:val="20"/>
                 <w:szCs w:val="20"/>
               </w:rPr>
-              <w:t xml:space="preserve">0 e 1 (TX/RX)</w:t>
+              <w:t xml:space="preserve">USB</w:t>
             </w:r>
           </w:p>
         </w:tc>

</xml_diff>